<commit_message>
feat(office): complete preview fidelity
Render DOCX notes and searchable document results.

Show XLSX links, comments, conditional visuals, sparklines, shapes, and controls in the viewer and Demo.
</commit_message>
<xml_diff>
--- a/apps/demo/public/samples/review-comments.docx
+++ b/apps/demo/public/samples/review-comments.docx
@@ -22,6 +22,12 @@
         </w:rPr>
         <w:commentReference w:id="0"/>
       </w:r>
+      <w:r>
+        <w:rPr>
+          <w:vertAlign w:val="superscript"/>
+        </w:rPr>
+        <w:footnoteReference w:id="1"/>
+      </w:r>
     </w:p>
     <w:p>
       <w:r>
@@ -42,6 +48,12 @@
       </w:ins>
       <w:r>
         <w:t>.</w:t>
+      </w:r>
+      <w:r>
+        <w:rPr>
+          <w:vertAlign w:val="superscript"/>
+        </w:rPr>
+        <w:endnoteReference w:id="1"/>
       </w:r>
     </w:p>
     <w:p>
@@ -73,6 +85,18 @@
 </w:comments>
 </file>
 
+<file path=word/endnotes.xml><?xml version="1.0" encoding="utf-8"?>
+<w:endnotes xmlns:w="http://schemas.openxmlformats.org/wordprocessingml/2006/main">
+  <w:endnote w:id="1">
+    <w:p>
+      <w:r>
+        <w:t>尾注正文：响应时间变更将在下一版合同中生效。</w:t>
+      </w:r>
+    </w:p>
+  </w:endnote>
+</w:endnotes>
+</file>
+
 <file path=word/footer1.xml><?xml version="1.0" encoding="utf-8"?>
 <w:ftr xmlns:m="http://schemas.openxmlformats.org/officeDocument/2006/math" xmlns:mc="http://schemas.openxmlformats.org/markup-compatibility/2006" xmlns:mo="http://schemas.microsoft.com/office/mac/office/2008/main" xmlns:mv="urn:schemas-microsoft-com:mac:vml" xmlns:o="urn:schemas-microsoft-com:office:office" xmlns:r="http://schemas.openxmlformats.org/officeDocument/2006/relationships" xmlns:v="urn:schemas-microsoft-com:vml" xmlns:w10="urn:schemas-microsoft-com:office:word" xmlns:w14="http://schemas.microsoft.com/office/word/2010/wordml" xmlns:w="http://schemas.openxmlformats.org/wordprocessingml/2006/main" xmlns:wne="http://schemas.microsoft.com/office/word/2006/wordml" xmlns:wp14="http://schemas.microsoft.com/office/word/2010/wordprocessingDrawing" xmlns:wp="http://schemas.openxmlformats.org/drawingml/2006/wordprocessingDrawing" xmlns:wpc="http://schemas.microsoft.com/office/word/2010/wordprocessingCanvas" xmlns:wpg="http://schemas.microsoft.com/office/word/2010/wordprocessingGroup" xmlns:wpi="http://schemas.microsoft.com/office/word/2010/wordprocessingInk" xmlns:wps="http://schemas.microsoft.com/office/word/2010/wordprocessingShape" mc:Ignorable="w14 wp14">
   <w:p>
@@ -85,6 +109,18 @@
     </w:r>
   </w:p>
 </w:ftr>
+</file>
+
+<file path=word/footnotes.xml><?xml version="1.0" encoding="utf-8"?>
+<w:footnotes xmlns:w="http://schemas.openxmlformats.org/wordprocessingml/2006/main">
+  <w:footnote w:id="1">
+    <w:p>
+      <w:r>
+        <w:t>脚注正文：服务级别摘要已经由审核人确认。</w:t>
+      </w:r>
+    </w:p>
+  </w:footnote>
+</w:footnotes>
 </file>
 
 <file path=word/header1.xml><?xml version="1.0" encoding="utf-8"?>

</xml_diff>